<commit_message>
Document recurrence model 8 (boxcar) in the HAZ notes
- Line 19b: add "8 = Boxcar" to the list of recurrence models.
- Line 19d: describe the boxcar mpdf parameters (mpdf1 = width, centred
  on the reference magnitude; mpdf2 and mpdf3 unused) and note that it
  is only available with activity rates. Highlighted, like the other
  new input options.
- FAQ 4.6: new "How do you specify a boxcar magnitude pdf?" section with
  a worked example and figure, in the same format as 4.3-4.5. Later FAQ
  sections renumber to 4.7-4.9; table of contents updated.

Co-Authored-By: Claude Opus 5.5 <noreply@anthropic.com>
Claude-Session: https://claude.ai/code/session_012hqFBNE5nDByFb9nHZs7cc
</commit_message>
<xml_diff>
--- a/docs/HAZ-45.3 Notes.docx
+++ b/docs/HAZ-45.3 Notes.docx
@@ -503,7 +503,7 @@
           <w:rPr>
             <w:webHidden/>
           </w:rPr>
-          <w:t>13</w:t>
+          <w:t>14</w:t>
         </w:r>
         <w:r>
           <w:rPr>
@@ -580,7 +580,7 @@
           <w:rPr>
             <w:webHidden/>
           </w:rPr>
-          <w:t>16</w:t>
+          <w:t>17</w:t>
         </w:r>
         <w:r>
           <w:rPr>
@@ -657,7 +657,7 @@
           <w:rPr>
             <w:webHidden/>
           </w:rPr>
-          <w:t>17</w:t>
+          <w:t>18</w:t>
         </w:r>
         <w:r>
           <w:rPr>
@@ -734,7 +734,7 @@
           <w:rPr>
             <w:webHidden/>
           </w:rPr>
-          <w:t>18</w:t>
+          <w:t>19</w:t>
         </w:r>
         <w:r>
           <w:rPr>
@@ -807,7 +807,7 @@
           <w:rPr>
             <w:webHidden/>
           </w:rPr>
-          <w:t>18</w:t>
+          <w:t>19</w:t>
         </w:r>
         <w:r>
           <w:rPr>
@@ -880,7 +880,7 @@
           <w:rPr>
             <w:webHidden/>
           </w:rPr>
-          <w:t>20</w:t>
+          <w:t>21</w:t>
         </w:r>
         <w:r>
           <w:rPr>
@@ -953,7 +953,7 @@
           <w:rPr>
             <w:webHidden/>
           </w:rPr>
-          <w:t>21</w:t>
+          <w:t>22</w:t>
         </w:r>
         <w:r>
           <w:rPr>
@@ -1026,7 +1026,7 @@
           <w:rPr>
             <w:webHidden/>
           </w:rPr>
-          <w:t>21</w:t>
+          <w:t>22</w:t>
         </w:r>
         <w:r>
           <w:rPr>
@@ -1099,7 +1099,7 @@
           <w:rPr>
             <w:webHidden/>
           </w:rPr>
-          <w:t>22</w:t>
+          <w:t>23</w:t>
         </w:r>
         <w:r>
           <w:rPr>
@@ -1118,12 +1118,80 @@
           <w:szCs w:val="22"/>
         </w:rPr>
       </w:pPr>
+      <w:hyperlink w:anchor="_Toc129252390" w:history="1">
+        <w:r>
+          <w:rPr>
+            <w:rStyle w:val="Hyperlink"/>
+          </w:rPr>
+          <w:t>4.6</w:t>
+        </w:r>
+        <w:r>
+          <w:rPr>
+            <w:rFonts w:asciiTheme="minorHAnsi" w:eastAsiaTheme="minorEastAsia" w:hAnsiTheme="minorHAnsi" w:cstheme="minorBidi"/>
+            <w:sz w:val="22"/>
+            <w:szCs w:val="22"/>
+          </w:rPr>
+          <w:tab/>
+        </w:r>
+        <w:r>
+          <w:rPr>
+            <w:rStyle w:val="Hyperlink"/>
+          </w:rPr>
+          <w:t>How do you specify a boxcar magnitude pdf?</w:t>
+        </w:r>
+        <w:r>
+          <w:rPr>
+            <w:webHidden/>
+          </w:rPr>
+          <w:tab/>
+        </w:r>
+        <w:r>
+          <w:rPr>
+            <w:webHidden/>
+          </w:rPr>
+          <w:fldChar w:fldCharType="begin"/>
+        </w:r>
+        <w:r>
+          <w:rPr>
+            <w:webHidden/>
+          </w:rPr>
+          <w:instrText xml:space="preserve"> PAGEREF _Toc129252390 \h </w:instrText>
+        </w:r>
+        <w:r>
+          <w:rPr>
+            <w:webHidden/>
+          </w:rPr>
+          <w:fldChar w:fldCharType="separate"/>
+        </w:r>
+        <w:r>
+          <w:rPr>
+            <w:webHidden/>
+          </w:rPr>
+          <w:t>24</w:t>
+        </w:r>
+        <w:r>
+          <w:rPr>
+            <w:webHidden/>
+          </w:rPr>
+          <w:fldChar w:fldCharType="end"/>
+        </w:r>
+      </w:hyperlink>
+    </w:p>
+    <w:p>
+      <w:pPr>
+        <w:pStyle w:val="TOC2"/>
+        <w:rPr>
+          <w:rFonts w:asciiTheme="minorHAnsi" w:eastAsiaTheme="minorEastAsia" w:hAnsiTheme="minorHAnsi" w:cstheme="minorBidi"/>
+          <w:sz w:val="22"/>
+          <w:szCs w:val="22"/>
+        </w:rPr>
+      </w:pPr>
       <w:hyperlink w:anchor="_Toc129252371" w:history="1">
         <w:r>
           <w:rPr>
             <w:rStyle w:val="Hyperlink"/>
           </w:rPr>
-          <w:t>4.6</w:t>
+          <w:t>4.7</w:t>
         </w:r>
         <w:r>
           <w:rPr>
@@ -1172,7 +1240,7 @@
           <w:rPr>
             <w:webHidden/>
           </w:rPr>
-          <w:t>23</w:t>
+          <w:t>25</w:t>
         </w:r>
         <w:r>
           <w:rPr>
@@ -1196,7 +1264,7 @@
           <w:rPr>
             <w:rStyle w:val="Hyperlink"/>
           </w:rPr>
-          <w:t>4.7</w:t>
+          <w:t>4.8</w:t>
         </w:r>
         <w:r>
           <w:rPr>
@@ -1245,7 +1313,7 @@
           <w:rPr>
             <w:webHidden/>
           </w:rPr>
-          <w:t>23</w:t>
+          <w:t>25</w:t>
         </w:r>
         <w:r>
           <w:rPr>
@@ -1269,7 +1337,7 @@
           <w:rPr>
             <w:rStyle w:val="Hyperlink"/>
           </w:rPr>
-          <w:t>4.8</w:t>
+          <w:t>4.9</w:t>
         </w:r>
         <w:r>
           <w:rPr>
@@ -1318,7 +1386,7 @@
           <w:rPr>
             <w:webHidden/>
           </w:rPr>
-          <w:t>24</w:t>
+          <w:t>26</w:t>
         </w:r>
         <w:r>
           <w:rPr>
@@ -4917,6 +4985,29 @@
       </w:pPr>
       <w:r>
         <w:tab/>
+        <w:tab/>
+        <w:tab/>
+        <w:tab/>
+      </w:r>
+      <w:r>
+        <w:rPr>
+          <w:highlight w:val="yellow"/>
+        </w:rPr>
+        <w:t>8 = Boxcar</w:t>
+      </w:r>
+    </w:p>
+    <w:p>
+      <w:pPr>
+        <w:tabs>
+          <w:tab w:val="left" w:pos="720"/>
+          <w:tab w:val="left" w:pos="1440"/>
+        </w:tabs>
+        <w:spacing w:line="240" w:lineRule="auto"/>
+        <w:ind w:left="2160" w:hanging="2160"/>
+        <w:contextualSpacing/>
+      </w:pPr>
+      <w:r>
+        <w:tab/>
       </w:r>
       <w:r>
         <w:tab/>
@@ -5408,6 +5499,100 @@
       </w:pPr>
       <w:r>
         <w:t>mpdf3 = magnitude adjustment value which defines the upper range in the distribution given the mean reference magnitude defined later in the fault file.</w:t>
+      </w:r>
+    </w:p>
+    <w:p>
+      <w:pPr>
+        <w:pStyle w:val="BodyTextIndent"/>
+        <w:spacing w:line="240" w:lineRule="auto"/>
+        <w:ind w:left="3060" w:hanging="900"/>
+        <w:contextualSpacing/>
+      </w:pPr>
+    </w:p>
+    <w:p>
+      <w:pPr>
+        <w:pStyle w:val="BodyTextIndent"/>
+        <w:spacing w:line="240" w:lineRule="auto"/>
+        <w:ind w:firstLine="1800"/>
+        <w:contextualSpacing/>
+      </w:pPr>
+      <w:r>
+        <w:rPr>
+          <w:highlight w:val="yellow"/>
+          <w:u w:val="single"/>
+        </w:rPr>
+        <w:t>Boxcar Model</w:t>
+      </w:r>
+    </w:p>
+    <w:p>
+      <w:pPr>
+        <w:pStyle w:val="BodyTextIndent"/>
+        <w:spacing w:line="240" w:lineRule="auto"/>
+        <w:ind w:left="3060" w:hanging="900"/>
+        <w:contextualSpacing/>
+      </w:pPr>
+      <w:r>
+        <w:rPr>
+          <w:highlight w:val="yellow"/>
+        </w:rPr>
+        <w:t xml:space="preserve">mpdf1 = magnitude width of the boxcar, e.g., 0.5. The reference magnitude defined later in the fault file is the center of the boxcar, so magnitudes range uniformly from refmag – mpdf1/2 to refmag + mpdf1/2.</w:t>
+      </w:r>
+    </w:p>
+    <w:p>
+      <w:pPr>
+        <w:pStyle w:val="BodyTextIndent"/>
+        <w:spacing w:line="240" w:lineRule="auto"/>
+        <w:ind w:left="3060" w:hanging="900"/>
+        <w:contextualSpacing/>
+      </w:pPr>
+      <w:r>
+        <w:rPr>
+          <w:highlight w:val="yellow"/>
+        </w:rPr>
+        <w:t xml:space="preserve">mpdf2 = not used (enter 0.0)</w:t>
+      </w:r>
+    </w:p>
+    <w:p>
+      <w:pPr>
+        <w:pStyle w:val="BodyTextIndent"/>
+        <w:spacing w:line="240" w:lineRule="auto"/>
+        <w:ind w:left="3060" w:hanging="900"/>
+        <w:contextualSpacing/>
+      </w:pPr>
+      <w:r>
+        <w:rPr>
+          <w:highlight w:val="yellow"/>
+        </w:rPr>
+        <w:t xml:space="preserve">mpdf3 = not used (enter 0.0)</w:t>
+      </w:r>
+    </w:p>
+    <w:p>
+      <w:pPr>
+        <w:pStyle w:val="BodyTextIndent"/>
+        <w:spacing w:line="240" w:lineRule="auto"/>
+        <w:ind w:left="3060" w:hanging="900"/>
+        <w:contextualSpacing/>
+      </w:pPr>
+    </w:p>
+    <w:p>
+      <w:pPr>
+        <w:pStyle w:val="BodyTextIndent"/>
+        <w:tabs>
+          <w:tab w:val="left" w:pos="2880"/>
+        </w:tabs>
+        <w:spacing w:line="240" w:lineRule="auto"/>
+        <w:ind w:left="2160" w:hanging="900"/>
+        <w:contextualSpacing/>
+      </w:pPr>
+      <w:r>
+        <w:tab/>
+        <w:tab/>
+      </w:r>
+      <w:r>
+        <w:rPr>
+          <w:highlight w:val="yellow"/>
+        </w:rPr>
+        <w:t xml:space="preserve">Note: The boxcar model is currently only available for sources defined by activity rates.</w:t>
       </w:r>
     </w:p>
     <w:p>
@@ -18134,6 +18319,453 @@
             </a:graphic>
           </wp:inline>
         </w:drawing>
+      </w:r>
+    </w:p>
+    <w:p>
+      <w:pPr>
+        <w:pStyle w:val="Heading2"/>
+      </w:pPr>
+      <w:bookmarkStart w:id="28" w:name="_Toc129252390"/>
+      <w:r>
+        <w:t>How do you specify a boxcar magnitude pdf?</w:t>
+      </w:r>
+      <w:bookmarkEnd w:id="28"/>
+    </w:p>
+    <w:p>
+      <w:pPr>
+        <w:pStyle w:val="BodyText"/>
+        <w:rPr>
+          <w:lang w:val="en-US"/>
+        </w:rPr>
+      </w:pPr>
+      <w:r>
+        <w:rPr>
+          <w:lang w:val="en-US"/>
+        </w:rPr>
+        <w:t xml:space="preserve">The boxcar model (sometimes called the maximum moment model) is recurrence model 8. The shape of this magnitude probability density function is that of a uniform distribution. Unlike the other models, the Maximum Magnitude listed in the fault file is the center of the boxcar rather than the largest magnitude. The following is an example:</w:t>
+      </w:r>
+    </w:p>
+    <w:p>
+      <w:pPr>
+        <w:pStyle w:val="BodyText"/>
+        <w:spacing w:after="120"/>
+        <w:rPr>
+          <w:lang w:val="en-US"/>
+        </w:rPr>
+      </w:pPr>
+      <w:r>
+        <w:rPr>
+          <w:lang w:val="en-US"/>
+        </w:rPr>
+        <w:tab/>
+      </w:r>
+      <w:r>
+        <w:rPr>
+          <w:i/>
+          <w:iCs/>
+          <w:lang w:val="en-US"/>
+        </w:rPr>
+        <w:t xml:space="preserve">MinMag</w:t>
+      </w:r>
+      <w:r>
+        <w:rPr>
+          <w:lang w:val="en-US"/>
+        </w:rPr>
+        <w:t xml:space="preserve">  </w:t>
+      </w:r>
+      <w:r>
+        <w:rPr>
+          <w:color w:val="0000FF"/>
+          <w:lang w:val="en-US"/>
+        </w:rPr>
+        <w:t xml:space="preserve">5.0</w:t>
+      </w:r>
+      <w:r>
+        <w:rPr>
+          <w:lang w:val="en-US"/>
+        </w:rPr>
+        <w:tab/>
+        <w:tab/>
+        <w:tab/>
+        <w:tab/>
+        <w:tab/>
+        <w:tab/>
+      </w:r>
+      <w:r>
+        <w:rPr>
+          <w:i/>
+          <w:iCs/>
+          <w:lang w:val="en-US"/>
+        </w:rPr>
+        <w:t xml:space="preserve">mpdf1</w:t>
+      </w:r>
+      <w:r>
+        <w:rPr>
+          <w:lang w:val="en-US"/>
+        </w:rPr>
+        <w:t xml:space="preserve">  </w:t>
+      </w:r>
+      <w:r>
+        <w:rPr>
+          <w:color w:val="0000FF"/>
+          <w:lang w:val="en-US"/>
+        </w:rPr>
+        <w:t xml:space="preserve">0.5</w:t>
+      </w:r>
+    </w:p>
+    <w:p>
+      <w:pPr>
+        <w:pStyle w:val="BodyText"/>
+        <w:spacing w:after="120"/>
+        <w:rPr>
+          <w:lang w:val="en-US"/>
+        </w:rPr>
+      </w:pPr>
+      <w:r>
+        <w:rPr>
+          <w:lang w:val="en-US"/>
+        </w:rPr>
+        <w:tab/>
+      </w:r>
+      <w:r>
+        <w:rPr>
+          <w:i/>
+          <w:iCs/>
+          <w:lang w:val="en-US"/>
+        </w:rPr>
+        <w:t xml:space="preserve">Maximum Magnitude</w:t>
+      </w:r>
+      <w:r>
+        <w:rPr>
+          <w:lang w:val="en-US"/>
+        </w:rPr>
+        <w:t xml:space="preserve">  </w:t>
+      </w:r>
+      <w:r>
+        <w:rPr>
+          <w:color w:val="0000FF"/>
+          <w:lang w:val="en-US"/>
+        </w:rPr>
+        <w:t xml:space="preserve">6.5</w:t>
+      </w:r>
+      <w:r>
+        <w:rPr>
+          <w:lang w:val="en-US"/>
+        </w:rPr>
+        <w:tab/>
+        <w:tab/>
+        <w:tab/>
+        <w:tab/>
+      </w:r>
+      <w:r>
+        <w:rPr>
+          <w:i/>
+          <w:iCs/>
+          <w:lang w:val="en-US"/>
+        </w:rPr>
+        <w:t xml:space="preserve">mpdf2</w:t>
+      </w:r>
+      <w:r>
+        <w:rPr>
+          <w:lang w:val="en-US"/>
+        </w:rPr>
+        <w:t xml:space="preserve">  </w:t>
+      </w:r>
+      <w:r>
+        <w:rPr>
+          <w:color w:val="0000FF"/>
+          <w:lang w:val="en-US"/>
+        </w:rPr>
+        <w:t xml:space="preserve">0.0</w:t>
+      </w:r>
+    </w:p>
+    <w:p>
+      <w:pPr>
+        <w:pStyle w:val="BodyText"/>
+        <w:rPr>
+          <w:lang w:val="en-US"/>
+        </w:rPr>
+      </w:pPr>
+      <w:r>
+        <w:rPr>
+          <w:lang w:val="en-US"/>
+        </w:rPr>
+        <w:tab/>
+      </w:r>
+      <w:r>
+        <w:rPr>
+          <w:i/>
+          <w:iCs/>
+          <w:lang w:val="en-US"/>
+        </w:rPr>
+        <w:t xml:space="preserve">Magstep</w:t>
+      </w:r>
+      <w:r>
+        <w:rPr>
+          <w:lang w:val="en-US"/>
+        </w:rPr>
+        <w:t xml:space="preserve">  </w:t>
+      </w:r>
+      <w:r>
+        <w:rPr>
+          <w:color w:val="0000FF"/>
+          <w:lang w:val="en-US"/>
+        </w:rPr>
+        <w:t xml:space="preserve">0.01</w:t>
+      </w:r>
+      <w:r>
+        <w:rPr>
+          <w:lang w:val="en-US"/>
+        </w:rPr>
+        <w:tab/>
+        <w:tab/>
+        <w:tab/>
+        <w:tab/>
+        <w:tab/>
+        <w:tab/>
+      </w:r>
+      <w:r>
+        <w:rPr>
+          <w:i/>
+          <w:iCs/>
+          <w:lang w:val="en-US"/>
+        </w:rPr>
+        <w:t xml:space="preserve">mpdf3</w:t>
+      </w:r>
+      <w:r>
+        <w:rPr>
+          <w:lang w:val="en-US"/>
+        </w:rPr>
+        <w:t xml:space="preserve">  </w:t>
+      </w:r>
+      <w:r>
+        <w:rPr>
+          <w:color w:val="0000FF"/>
+          <w:lang w:val="en-US"/>
+        </w:rPr>
+        <w:t xml:space="preserve">0.0</w:t>
+      </w:r>
+    </w:p>
+    <w:p>
+      <w:pPr>
+        <w:pStyle w:val="BodyText"/>
+        <w:rPr>
+          <w:lang w:val="en-US"/>
+        </w:rPr>
+      </w:pPr>
+      <w:r>
+        <w:rPr>
+          <w:lang w:val="en-US"/>
+        </w:rPr>
+        <w:t xml:space="preserve">The code uses these inputs to compute the True Max (the largest magnitude in the distribution) and the True Min (the smallest magnitude in the distribution):</w:t>
+      </w:r>
+    </w:p>
+    <w:p>
+      <w:pPr>
+        <w:pStyle w:val="BodyText"/>
+        <w:rPr>
+          <w:lang w:val="en-US"/>
+        </w:rPr>
+      </w:pPr>
+      <w:r>
+        <w:rPr>
+          <w:lang w:val="en-US"/>
+        </w:rPr>
+        <w:tab/>
+      </w:r>
+      <w:r>
+        <w:rPr>
+          <w:lang w:val="en-US"/>
+        </w:rPr>
+        <w:t xml:space="preserve">True Max = </w:t>
+      </w:r>
+      <w:r>
+        <w:rPr>
+          <w:i/>
+          <w:iCs/>
+          <w:lang w:val="en-US"/>
+        </w:rPr>
+        <w:t xml:space="preserve">Maximum Magnitude</w:t>
+      </w:r>
+      <w:r>
+        <w:rPr>
+          <w:lang w:val="en-US"/>
+        </w:rPr>
+        <w:t xml:space="preserve"> + </w:t>
+      </w:r>
+      <w:r>
+        <w:rPr>
+          <w:i/>
+          <w:iCs/>
+          <w:lang w:val="en-US"/>
+        </w:rPr>
+        <w:t xml:space="preserve">mpdf1</w:t>
+      </w:r>
+      <w:r>
+        <w:rPr>
+          <w:lang w:val="en-US"/>
+        </w:rPr>
+        <w:t xml:space="preserve"> / 2</w:t>
+      </w:r>
+      <w:r>
+        <w:rPr>
+          <w:lang w:val="en-US"/>
+        </w:rPr>
+        <w:t xml:space="preserve">  </w:t>
+        <w:sym w:font="Wingdings" w:char="F0E0"/>
+        <w:t xml:space="preserve">  </w:t>
+      </w:r>
+      <w:r>
+        <w:rPr>
+          <w:lang w:val="en-US"/>
+        </w:rPr>
+        <w:t xml:space="preserve">6.75 = </w:t>
+      </w:r>
+      <w:r>
+        <w:rPr>
+          <w:color w:val="0000FF"/>
+          <w:lang w:val="en-US"/>
+        </w:rPr>
+        <w:t xml:space="preserve">6.5</w:t>
+      </w:r>
+      <w:r>
+        <w:rPr>
+          <w:lang w:val="en-US"/>
+        </w:rPr>
+        <w:t xml:space="preserve"> + </w:t>
+      </w:r>
+      <w:r>
+        <w:rPr>
+          <w:color w:val="0000FF"/>
+          <w:lang w:val="en-US"/>
+        </w:rPr>
+        <w:t xml:space="preserve">0.5</w:t>
+      </w:r>
+      <w:r>
+        <w:rPr>
+          <w:lang w:val="en-US"/>
+        </w:rPr>
+        <w:t xml:space="preserve"> / 2</w:t>
+      </w:r>
+    </w:p>
+    <w:p>
+      <w:pPr>
+        <w:pStyle w:val="BodyText"/>
+        <w:rPr>
+          <w:lang w:val="en-US"/>
+        </w:rPr>
+      </w:pPr>
+      <w:r>
+        <w:rPr>
+          <w:lang w:val="en-US"/>
+        </w:rPr>
+        <w:tab/>
+      </w:r>
+      <w:r>
+        <w:rPr>
+          <w:lang w:val="en-US"/>
+        </w:rPr>
+        <w:t xml:space="preserve">True Min = True Max – </w:t>
+      </w:r>
+      <w:r>
+        <w:rPr>
+          <w:i/>
+          <w:iCs/>
+          <w:lang w:val="en-US"/>
+        </w:rPr>
+        <w:t xml:space="preserve">mpdf1</w:t>
+      </w:r>
+      <w:r>
+        <w:rPr>
+          <w:lang w:val="en-US"/>
+        </w:rPr>
+        <w:t xml:space="preserve">  </w:t>
+        <w:sym w:font="Wingdings" w:char="F0E0"/>
+        <w:t xml:space="preserve">  </w:t>
+      </w:r>
+      <w:r>
+        <w:rPr>
+          <w:lang w:val="en-US"/>
+        </w:rPr>
+        <w:t xml:space="preserve">6.25 = 6.75 – </w:t>
+      </w:r>
+      <w:r>
+        <w:rPr>
+          <w:color w:val="0000FF"/>
+          <w:lang w:val="en-US"/>
+        </w:rPr>
+        <w:t xml:space="preserve">0.5</w:t>
+      </w:r>
+    </w:p>
+    <w:p>
+      <w:pPr>
+        <w:pStyle w:val="BodyText"/>
+        <w:jc w:val="center"/>
+      </w:pPr>
+      <w:r>
+        <w:rPr>
+          <w:noProof/>
+          <w:lang w:val="en-US"/>
+        </w:rPr>
+        <w:drawing>
+          <wp:inline distT="0" distB="0" distL="0" distR="0">
+            <wp:extent cx="2895600" cy="2603500"/>
+            <wp:effectExtent l="0" t="0" r="0" b="6350"/>
+            <wp:docPr id="55" name="Picture 55"/>
+            <wp:cNvGraphicFramePr>
+              <a:graphicFrameLocks xmlns:a="http://schemas.openxmlformats.org/drawingml/2006/main" noChangeAspect="1"/>
+            </wp:cNvGraphicFramePr>
+            <a:graphic xmlns:a="http://schemas.openxmlformats.org/drawingml/2006/main">
+              <a:graphicData uri="http://schemas.openxmlformats.org/drawingml/2006/picture">
+                <pic:pic xmlns:pic="http://schemas.openxmlformats.org/drawingml/2006/picture">
+                  <pic:nvPicPr>
+                    <pic:cNvPr id="0" name="Boxcar pdf"/>
+                    <pic:cNvPicPr>
+                      <a:picLocks noChangeAspect="1" noChangeArrowheads="1"/>
+                    </pic:cNvPicPr>
+                  </pic:nvPicPr>
+                  <pic:blipFill>
+                    <a:blip r:embed="rId32">
+                      <a:extLst>
+                        <a:ext uri="{28A0092B-C50C-407E-A947-70E740481C1C}">
+                          <a14:useLocalDpi xmlns:a14="http://schemas.microsoft.com/office/drawing/2010/main" val="0"/>
+                        </a:ext>
+                      </a:extLst>
+                    </a:blip>
+                    <a:srcRect/>
+                    <a:stretch>
+                      <a:fillRect/>
+                    </a:stretch>
+                  </pic:blipFill>
+                  <pic:spPr bwMode="auto">
+                    <a:xfrm>
+                      <a:off x="0" y="0"/>
+                      <a:ext cx="2895600" cy="2603500"/>
+                    </a:xfrm>
+                    <a:prstGeom prst="rect">
+                      <a:avLst/>
+                    </a:prstGeom>
+                    <a:noFill/>
+                  </pic:spPr>
+                </pic:pic>
+              </a:graphicData>
+            </a:graphic>
+          </wp:inline>
+        </w:drawing>
+      </w:r>
+    </w:p>
+    <w:p>
+      <w:pPr>
+        <w:pStyle w:val="BodyText"/>
+        <w:rPr>
+          <w:lang w:val="en-US"/>
+        </w:rPr>
+      </w:pPr>
+      <w:r>
+        <w:rPr>
+          <w:lang w:val="en-US"/>
+        </w:rPr>
+        <w:t xml:space="preserve">Every magnitude between the True Min and the True Max is equally likely. The boxcar model is currently only available for sources defined by activity rates.</w:t>
       </w:r>
     </w:p>
     <w:p>

</xml_diff>